<commit_message>
feat(qrcode): Ajout d'un QRCode ammenant aux ressources.
</commit_message>
<xml_diff>
--- a/Ressources/tests/doc-explicatifs/doc-explicatifs.docx
+++ b/Ressources/tests/doc-explicatifs/doc-explicatifs.docx
@@ -75,11 +75,19 @@
           <w:rFonts w:ascii="Arial" w:eastAsia="Times New Roman" w:hAnsi="Arial" w:cs="Arial"/>
         </w:rPr>
       </w:pPr>
-      <w:r>
-        <w:rPr>
-          <w:rFonts w:ascii="Arial" w:eastAsia="Times New Roman" w:hAnsi="Arial" w:cs="Arial"/>
-        </w:rPr>
-        <w:t>les développeurs,</w:t>
+      <w:proofErr w:type="gramStart"/>
+      <w:r>
+        <w:rPr>
+          <w:rFonts w:ascii="Arial" w:eastAsia="Times New Roman" w:hAnsi="Arial" w:cs="Arial"/>
+        </w:rPr>
+        <w:t>les</w:t>
+      </w:r>
+      <w:proofErr w:type="gramEnd"/>
+      <w:r>
+        <w:rPr>
+          <w:rFonts w:ascii="Arial" w:eastAsia="Times New Roman" w:hAnsi="Arial" w:cs="Arial"/>
+        </w:rPr>
+        <w:t xml:space="preserve"> développeurs,</w:t>
       </w:r>
     </w:p>
     <w:p>
@@ -95,11 +103,19 @@
           <w:rFonts w:ascii="Arial" w:eastAsia="Times New Roman" w:hAnsi="Arial" w:cs="Arial"/>
         </w:rPr>
       </w:pPr>
-      <w:r>
-        <w:rPr>
-          <w:rFonts w:ascii="Arial" w:eastAsia="Times New Roman" w:hAnsi="Arial" w:cs="Arial"/>
-        </w:rPr>
-        <w:t>les testeurs (QA),</w:t>
+      <w:proofErr w:type="gramStart"/>
+      <w:r>
+        <w:rPr>
+          <w:rFonts w:ascii="Arial" w:eastAsia="Times New Roman" w:hAnsi="Arial" w:cs="Arial"/>
+        </w:rPr>
+        <w:t>les</w:t>
+      </w:r>
+      <w:proofErr w:type="gramEnd"/>
+      <w:r>
+        <w:rPr>
+          <w:rFonts w:ascii="Arial" w:eastAsia="Times New Roman" w:hAnsi="Arial" w:cs="Arial"/>
+        </w:rPr>
+        <w:t xml:space="preserve"> testeurs (QA),</w:t>
       </w:r>
     </w:p>
     <w:p>
@@ -115,11 +131,33 @@
           <w:rFonts w:ascii="Arial" w:eastAsia="Times New Roman" w:hAnsi="Arial" w:cs="Arial"/>
         </w:rPr>
       </w:pPr>
-      <w:r>
-        <w:rPr>
-          <w:rFonts w:ascii="Arial" w:eastAsia="Times New Roman" w:hAnsi="Arial" w:cs="Arial"/>
-        </w:rPr>
-        <w:t>les Product Owners,</w:t>
+      <w:proofErr w:type="gramStart"/>
+      <w:r>
+        <w:rPr>
+          <w:rFonts w:ascii="Arial" w:eastAsia="Times New Roman" w:hAnsi="Arial" w:cs="Arial"/>
+        </w:rPr>
+        <w:t>les</w:t>
+      </w:r>
+      <w:proofErr w:type="gramEnd"/>
+      <w:r>
+        <w:rPr>
+          <w:rFonts w:ascii="Arial" w:eastAsia="Times New Roman" w:hAnsi="Arial" w:cs="Arial"/>
+        </w:rPr>
+        <w:t xml:space="preserve"> Product </w:t>
+      </w:r>
+      <w:proofErr w:type="spellStart"/>
+      <w:r>
+        <w:rPr>
+          <w:rFonts w:ascii="Arial" w:eastAsia="Times New Roman" w:hAnsi="Arial" w:cs="Arial"/>
+        </w:rPr>
+        <w:t>Owners</w:t>
+      </w:r>
+      <w:proofErr w:type="spellEnd"/>
+      <w:r>
+        <w:rPr>
+          <w:rFonts w:ascii="Arial" w:eastAsia="Times New Roman" w:hAnsi="Arial" w:cs="Arial"/>
+        </w:rPr>
+        <w:t>,</w:t>
       </w:r>
     </w:p>
     <w:p>
@@ -135,11 +173,19 @@
           <w:rFonts w:ascii="Arial" w:eastAsia="Times New Roman" w:hAnsi="Arial" w:cs="Arial"/>
         </w:rPr>
       </w:pPr>
-      <w:r>
-        <w:rPr>
-          <w:rFonts w:ascii="Arial" w:eastAsia="Times New Roman" w:hAnsi="Arial" w:cs="Arial"/>
-        </w:rPr>
-        <w:t>les équipes d’intégration,</w:t>
+      <w:proofErr w:type="gramStart"/>
+      <w:r>
+        <w:rPr>
+          <w:rFonts w:ascii="Arial" w:eastAsia="Times New Roman" w:hAnsi="Arial" w:cs="Arial"/>
+        </w:rPr>
+        <w:t>les</w:t>
+      </w:r>
+      <w:proofErr w:type="gramEnd"/>
+      <w:r>
+        <w:rPr>
+          <w:rFonts w:ascii="Arial" w:eastAsia="Times New Roman" w:hAnsi="Arial" w:cs="Arial"/>
+        </w:rPr>
+        <w:t xml:space="preserve"> équipes d’intégration,</w:t>
       </w:r>
     </w:p>
     <w:p>
@@ -155,11 +201,19 @@
           <w:rFonts w:ascii="Arial" w:eastAsia="Times New Roman" w:hAnsi="Arial" w:cs="Arial"/>
         </w:rPr>
       </w:pPr>
-      <w:r>
-        <w:rPr>
-          <w:rFonts w:ascii="Arial" w:eastAsia="Times New Roman" w:hAnsi="Arial" w:cs="Arial"/>
-        </w:rPr>
-        <w:t>et même les outils de tests automatisés.</w:t>
+      <w:proofErr w:type="gramStart"/>
+      <w:r>
+        <w:rPr>
+          <w:rFonts w:ascii="Arial" w:eastAsia="Times New Roman" w:hAnsi="Arial" w:cs="Arial"/>
+        </w:rPr>
+        <w:t>et</w:t>
+      </w:r>
+      <w:proofErr w:type="gramEnd"/>
+      <w:r>
+        <w:rPr>
+          <w:rFonts w:ascii="Arial" w:eastAsia="Times New Roman" w:hAnsi="Arial" w:cs="Arial"/>
+        </w:rPr>
+        <w:t xml:space="preserve"> même les outils de tests automatisés.</w:t>
       </w:r>
     </w:p>
     <w:p>
@@ -174,7 +228,77 @@
         <w:rPr>
           <w:rFonts w:ascii="Arial" w:eastAsia="Times New Roman" w:hAnsi="Arial" w:cs="Arial"/>
         </w:rPr>
-        <w:t xml:space="preserve">Chaque IDE ou plateforme possède son propre framework de tests automatisés (ATF pour ServiceNow, JUnit pour Java/Kotlin, XUnit pour C#, PyTest pour Python…). </w:t>
+        <w:t xml:space="preserve">Chaque IDE ou plateforme possède son propre </w:t>
+      </w:r>
+      <w:proofErr w:type="spellStart"/>
+      <w:r>
+        <w:rPr>
+          <w:rFonts w:ascii="Arial" w:eastAsia="Times New Roman" w:hAnsi="Arial" w:cs="Arial"/>
+        </w:rPr>
+        <w:t>framework</w:t>
+      </w:r>
+      <w:proofErr w:type="spellEnd"/>
+      <w:r>
+        <w:rPr>
+          <w:rFonts w:ascii="Arial" w:eastAsia="Times New Roman" w:hAnsi="Arial" w:cs="Arial"/>
+        </w:rPr>
+        <w:t xml:space="preserve"> de tests automatisés (ATF pour </w:t>
+      </w:r>
+      <w:proofErr w:type="spellStart"/>
+      <w:r>
+        <w:rPr>
+          <w:rFonts w:ascii="Arial" w:eastAsia="Times New Roman" w:hAnsi="Arial" w:cs="Arial"/>
+        </w:rPr>
+        <w:t>ServiceNow</w:t>
+      </w:r>
+      <w:proofErr w:type="spellEnd"/>
+      <w:r>
+        <w:rPr>
+          <w:rFonts w:ascii="Arial" w:eastAsia="Times New Roman" w:hAnsi="Arial" w:cs="Arial"/>
+        </w:rPr>
+        <w:t>, JUnit pour Java/</w:t>
+      </w:r>
+      <w:proofErr w:type="spellStart"/>
+      <w:r>
+        <w:rPr>
+          <w:rFonts w:ascii="Arial" w:eastAsia="Times New Roman" w:hAnsi="Arial" w:cs="Arial"/>
+        </w:rPr>
+        <w:t>Kotlin</w:t>
+      </w:r>
+      <w:proofErr w:type="spellEnd"/>
+      <w:r>
+        <w:rPr>
+          <w:rFonts w:ascii="Arial" w:eastAsia="Times New Roman" w:hAnsi="Arial" w:cs="Arial"/>
+        </w:rPr>
+        <w:t xml:space="preserve">, </w:t>
+      </w:r>
+      <w:proofErr w:type="spellStart"/>
+      <w:r>
+        <w:rPr>
+          <w:rFonts w:ascii="Arial" w:eastAsia="Times New Roman" w:hAnsi="Arial" w:cs="Arial"/>
+        </w:rPr>
+        <w:t>XUnit</w:t>
+      </w:r>
+      <w:proofErr w:type="spellEnd"/>
+      <w:r>
+        <w:rPr>
+          <w:rFonts w:ascii="Arial" w:eastAsia="Times New Roman" w:hAnsi="Arial" w:cs="Arial"/>
+        </w:rPr>
+        <w:t xml:space="preserve"> pour C#, </w:t>
+      </w:r>
+      <w:proofErr w:type="spellStart"/>
+      <w:r>
+        <w:rPr>
+          <w:rFonts w:ascii="Arial" w:eastAsia="Times New Roman" w:hAnsi="Arial" w:cs="Arial"/>
+        </w:rPr>
+        <w:t>PyTest</w:t>
+      </w:r>
+      <w:proofErr w:type="spellEnd"/>
+      <w:r>
+        <w:rPr>
+          <w:rFonts w:ascii="Arial" w:eastAsia="Times New Roman" w:hAnsi="Arial" w:cs="Arial"/>
+        </w:rPr>
+        <w:t xml:space="preserve"> pour Python…). </w:t>
       </w:r>
       <w:r>
         <w:rPr>
@@ -515,7 +639,21 @@
         <w:rPr>
           <w:rFonts w:ascii="Arial" w:hAnsi="Arial" w:cs="Arial"/>
         </w:rPr>
-        <w:t xml:space="preserve">Ce sont les ressources nécessaires, pas des données métier existantes. </w:t>
+        <w:t xml:space="preserve">Ce sont les ressources nécessaires, pas des données </w:t>
+      </w:r>
+      <w:proofErr w:type="gramStart"/>
+      <w:r>
+        <w:rPr>
+          <w:rFonts w:ascii="Arial" w:hAnsi="Arial" w:cs="Arial"/>
+        </w:rPr>
+        <w:t>métier existantes</w:t>
+      </w:r>
+      <w:proofErr w:type="gramEnd"/>
+      <w:r>
+        <w:rPr>
+          <w:rFonts w:ascii="Arial" w:hAnsi="Arial" w:cs="Arial"/>
+        </w:rPr>
+        <w:t xml:space="preserve">. </w:t>
       </w:r>
     </w:p>
     <w:p>
@@ -723,17 +861,20 @@
         <w:divId w:val="457146338"/>
         <w:rPr>
           <w:rFonts w:ascii="Arial" w:eastAsia="Times New Roman" w:hAnsi="Arial" w:cs="Arial"/>
-        </w:rPr>
-      </w:pPr>
-      <w:r>
-        <w:rPr>
-          <w:rFonts w:ascii="Arial" w:eastAsia="Times New Roman" w:hAnsi="Arial" w:cs="Arial"/>
+          <w:lang w:val="en-GB"/>
+        </w:rPr>
+      </w:pPr>
+      <w:r>
+        <w:rPr>
+          <w:rFonts w:ascii="Arial" w:eastAsia="Times New Roman" w:hAnsi="Arial" w:cs="Arial"/>
+          <w:lang w:val="en-GB"/>
         </w:rPr>
         <w:t>4.3. Tests E2E (End</w:t>
       </w:r>
       <w:r>
         <w:rPr>
           <w:rFonts w:ascii="Arial" w:eastAsia="Times New Roman" w:hAnsi="Arial" w:cs="Arial"/>
+          <w:lang w:val="en-GB"/>
         </w:rPr>
         <w:noBreakHyphen/>
         <w:t>to</w:t>
@@ -741,6 +882,7 @@
       <w:r>
         <w:rPr>
           <w:rFonts w:ascii="Arial" w:eastAsia="Times New Roman" w:hAnsi="Arial" w:cs="Arial"/>
+          <w:lang w:val="en-GB"/>
         </w:rPr>
         <w:noBreakHyphen/>
         <w:t>End)</w:t>
@@ -781,7 +923,21 @@
         <w:rPr>
           <w:rFonts w:ascii="Arial" w:eastAsia="Times New Roman" w:hAnsi="Arial" w:cs="Arial"/>
         </w:rPr>
-        <w:t xml:space="preserve"> Ce scénario peut ensuite être automatisé dans n’importe quel framework, car il suit une structure universelle : prérequis → étapes → résultats attendus. </w:t>
+        <w:t xml:space="preserve"> Ce scénario peut ensuite être automatisé dans n’importe quel </w:t>
+      </w:r>
+      <w:proofErr w:type="spellStart"/>
+      <w:r>
+        <w:rPr>
+          <w:rFonts w:ascii="Arial" w:eastAsia="Times New Roman" w:hAnsi="Arial" w:cs="Arial"/>
+        </w:rPr>
+        <w:t>framework</w:t>
+      </w:r>
+      <w:proofErr w:type="spellEnd"/>
+      <w:r>
+        <w:rPr>
+          <w:rFonts w:ascii="Arial" w:eastAsia="Times New Roman" w:hAnsi="Arial" w:cs="Arial"/>
+        </w:rPr>
+        <w:t xml:space="preserve">, car il suit une structure universelle : prérequis → étapes → résultats attendus. </w:t>
       </w:r>
     </w:p>
     <w:p>
@@ -927,7 +1083,87 @@
         <w:rPr>
           <w:rFonts w:ascii="Arial" w:hAnsi="Arial" w:cs="Arial"/>
         </w:rPr>
-        <w:t xml:space="preserve">Un formulaire de test détaillé est un outil de communication, un support de collaboration et un pont entre les équipes et les outils. Il permet de décrire un test de manière neutre, reproductible et universelle, indépendamment du langage, de la technologie ou du framework utilisé. </w:t>
+        <w:drawing>
+          <wp:anchor distT="0" distB="0" distL="114300" distR="114300" simplePos="0" relativeHeight="251658240" behindDoc="1" locked="0" layoutInCell="1" allowOverlap="1" wp14:anchorId="28720B0F" wp14:editId="352ACDB9">
+            <wp:simplePos x="0" y="0"/>
+            <wp:positionH relativeFrom="column">
+              <wp:posOffset>2079625</wp:posOffset>
+            </wp:positionH>
+            <wp:positionV relativeFrom="paragraph">
+              <wp:posOffset>1506220</wp:posOffset>
+            </wp:positionV>
+            <wp:extent cx="1432560" cy="1463040"/>
+            <wp:effectExtent l="0" t="0" r="0" b="3810"/>
+            <wp:wrapNone/>
+            <wp:docPr id="1718235585" name="Image 1"/>
+            <wp:cNvGraphicFramePr>
+              <a:graphicFrameLocks xmlns:a="http://schemas.openxmlformats.org/drawingml/2006/main" noChangeAspect="1"/>
+            </wp:cNvGraphicFramePr>
+            <a:graphic xmlns:a="http://schemas.openxmlformats.org/drawingml/2006/main">
+              <a:graphicData uri="http://schemas.openxmlformats.org/drawingml/2006/picture">
+                <pic:pic xmlns:pic="http://schemas.openxmlformats.org/drawingml/2006/picture">
+                  <pic:nvPicPr>
+                    <pic:cNvPr id="1718235585" name=""/>
+                    <pic:cNvPicPr/>
+                  </pic:nvPicPr>
+                  <pic:blipFill>
+                    <a:blip r:embed="rId5">
+                      <a:extLst>
+                        <a:ext uri="{28A0092B-C50C-407E-A947-70E740481C1C}">
+                          <a14:useLocalDpi xmlns:a14="http://schemas.microsoft.com/office/drawing/2010/main" val="0"/>
+                        </a:ext>
+                      </a:extLst>
+                    </a:blip>
+                    <a:stretch>
+                      <a:fillRect/>
+                    </a:stretch>
+                  </pic:blipFill>
+                  <pic:spPr>
+                    <a:xfrm>
+                      <a:off x="0" y="0"/>
+                      <a:ext cx="1432560" cy="1463040"/>
+                    </a:xfrm>
+                    <a:prstGeom prst="rect">
+                      <a:avLst/>
+                    </a:prstGeom>
+                  </pic:spPr>
+                </pic:pic>
+              </a:graphicData>
+            </a:graphic>
+            <wp14:sizeRelH relativeFrom="page">
+              <wp14:pctWidth>0</wp14:pctWidth>
+            </wp14:sizeRelH>
+            <wp14:sizeRelV relativeFrom="page">
+              <wp14:pctHeight>0</wp14:pctHeight>
+            </wp14:sizeRelV>
+          </wp:anchor>
+        </w:drawing>
+      </w:r>
+      <w:r>
+        <w:rPr>
+          <w:rFonts w:ascii="Arial" w:hAnsi="Arial" w:cs="Arial"/>
+        </w:rPr>
+        <w:t xml:space="preserve">Un formulaire de test détaillé est un outil de communication, un support de collaboration et un pont entre les équipes et les outils. Il permet de décrire un test de manière neutre, reproductible et universelle, indépendamment du langage, de la technologie ou du </w:t>
+      </w:r>
+      <w:proofErr w:type="spellStart"/>
+      <w:r>
+        <w:rPr>
+          <w:rFonts w:ascii="Arial" w:hAnsi="Arial" w:cs="Arial"/>
+        </w:rPr>
+        <w:t>framework</w:t>
+      </w:r>
+      <w:proofErr w:type="spellEnd"/>
+      <w:r>
+        <w:rPr>
+          <w:rFonts w:ascii="Arial" w:hAnsi="Arial" w:cs="Arial"/>
+        </w:rPr>
+        <w:t xml:space="preserve"> utilisé.</w:t>
+      </w:r>
+      <w:r>
+        <w:rPr>
+          <w:noProof/>
+        </w:rPr>
+        <w:t xml:space="preserve"> </w:t>
       </w:r>
     </w:p>
     <w:sectPr>

</xml_diff>